<commit_message>
feat: add quotation and operational document controllers, views, and documentation
</commit_message>
<xml_diff>
--- a/docs/QUOTATION - SALES.docx
+++ b/docs/QUOTATION - SALES.docx
@@ -1,6 +1,6 @@
 
 <file path=word/document.xml><?xml version="1.0" encoding="utf-8"?>
-<w:document xmlns:wpc="http://schemas.microsoft.com/office/word/2010/wordprocessingCanvas" xmlns:cx="http://schemas.microsoft.com/office/drawing/2014/chartex" xmlns:cx1="http://schemas.microsoft.com/office/drawing/2015/9/8/chartex" xmlns:cx2="http://schemas.microsoft.com/office/drawing/2015/10/21/chartex" xmlns:cx3="http://schemas.microsoft.com/office/drawing/2016/5/9/chartex" xmlns:cx4="http://schemas.microsoft.com/office/drawing/2016/5/10/chartex" xmlns:cx5="http://schemas.microsoft.com/office/drawing/2016/5/11/chartex" xmlns:cx6="http://schemas.microsoft.com/office/drawing/2016/5/12/chartex" xmlns:cx7="http://schemas.microsoft.com/office/drawing/2016/5/13/chartex" xmlns:cx8="http://schemas.microsoft.com/office/drawing/2016/5/14/chartex" xmlns:mc="http://schemas.openxmlformats.org/markup-compatibility/2006" xmlns:aink="http://schemas.microsoft.com/office/drawing/2016/ink" xmlns:am3d="http://schemas.microsoft.com/office/drawing/2017/model3d" xmlns:o="urn:schemas-microsoft-com:office:office" xmlns:oel="http://schemas.microsoft.com/office/2019/extlst" xmlns:r="http://schemas.openxmlformats.org/officeDocument/2006/relationships" xmlns:m="http://schemas.openxmlformats.org/officeDocument/2006/math" xmlns:v="urn:schemas-microsoft-com:vml" xmlns:wp14="http://schemas.microsoft.com/office/word/2010/wordprocessingDrawing" xmlns:wp="http://schemas.openxmlformats.org/drawingml/2006/wordprocessingDrawing" xmlns:w10="urn:schemas-microsoft-com:office:word" xmlns:w="http://schemas.openxmlformats.org/wordprocessingml/2006/main" xmlns:w14="http://schemas.microsoft.com/office/word/2010/wordml" xmlns:w15="http://schemas.microsoft.com/office/word/2012/wordml" xmlns:w16cex="http://schemas.microsoft.com/office/word/2018/wordml/cex" xmlns:w16cid="http://schemas.microsoft.com/office/word/2016/wordml/cid" xmlns:w16="http://schemas.microsoft.com/office/word/2018/wordml" xmlns:w16du="http://schemas.microsoft.com/office/word/2023/wordml/word16du" xmlns:w16sdtdh="http://schemas.microsoft.com/office/word/2020/wordml/sdtdatahash" xmlns:w16sdtfl="http://schemas.microsoft.com/office/word/2024/wordml/sdtformatlock" xmlns:w16se="http://schemas.microsoft.com/office/word/2015/wordml/symex" xmlns:wpg="http://schemas.microsoft.com/office/word/2010/wordprocessingGroup" xmlns:wpi="http://schemas.microsoft.com/office/word/2010/wordprocessingInk" xmlns:wne="http://schemas.microsoft.com/office/word/2006/wordml" xmlns:wps="http://schemas.microsoft.com/office/word/2010/wordprocessingShape" mc:Ignorable="w14 w15 w16se w16cid w16 w16cex w16sdtdh w16sdtfl w16du wp14">
+<w:document xmlns:wpc="http://schemas.microsoft.com/office/word/2010/wordprocessingCanvas" xmlns:cx="http://schemas.microsoft.com/office/drawing/2014/chartex" xmlns:cx1="http://schemas.microsoft.com/office/drawing/2015/9/8/chartex" xmlns:cx2="http://schemas.microsoft.com/office/drawing/2015/10/21/chartex" xmlns:cx3="http://schemas.microsoft.com/office/drawing/2016/5/9/chartex" xmlns:cx4="http://schemas.microsoft.com/office/drawing/2016/5/10/chartex" xmlns:cx5="http://schemas.microsoft.com/office/drawing/2016/5/11/chartex" xmlns:cx6="http://schemas.microsoft.com/office/drawing/2016/5/12/chartex" xmlns:cx7="http://schemas.microsoft.com/office/drawing/2016/5/13/chartex" xmlns:cx8="http://schemas.microsoft.com/office/drawing/2016/5/14/chartex" xmlns:mc="http://schemas.openxmlformats.org/markup-compatibility/2006" xmlns:aink="http://schemas.microsoft.com/office/drawing/2016/ink" xmlns:am3d="http://schemas.microsoft.com/office/drawing/2017/model3d" xmlns:o="urn:schemas-microsoft-com:office:office" xmlns:oel="http://schemas.microsoft.com/office/2019/extlst" xmlns:r="http://schemas.openxmlformats.org/officeDocument/2006/relationships" xmlns:m="http://schemas.openxmlformats.org/officeDocument/2006/math" xmlns:v="urn:schemas-microsoft-com:vml" xmlns:wp14="http://schemas.microsoft.com/office/word/2010/wordprocessingDrawing" xmlns:wp="http://schemas.openxmlformats.org/drawingml/2006/wordprocessingDrawing" xmlns:w10="urn:schemas-microsoft-com:office:word" xmlns:w="http://schemas.openxmlformats.org/wordprocessingml/2006/main" xmlns:w14="http://schemas.microsoft.com/office/word/2010/wordml" xmlns:w15="http://schemas.microsoft.com/office/word/2012/wordml" xmlns:w16cex="http://schemas.microsoft.com/office/word/2018/wordml/cex" xmlns:w16cid="http://schemas.microsoft.com/office/word/2016/wordml/cid" xmlns:w16="http://schemas.microsoft.com/office/word/2018/wordml" xmlns:w16sdtdh="http://schemas.microsoft.com/office/word/2020/wordml/sdtdatahash" xmlns:w16se="http://schemas.microsoft.com/office/word/2015/wordml/symex" xmlns:wpg="http://schemas.microsoft.com/office/word/2010/wordprocessingGroup" xmlns:wpi="http://schemas.microsoft.com/office/word/2010/wordprocessingInk" xmlns:wne="http://schemas.microsoft.com/office/word/2006/wordml" xmlns:wps="http://schemas.microsoft.com/office/word/2010/wordprocessingShape" mc:Ignorable="w14 w15 w16se w16cid w16 w16cex w16sdtdh wp14">
   <w:body>
     <w:p>
       <w:pPr>
@@ -469,15 +469,7 @@
           <w:b/>
           <w:sz w:val="18"/>
         </w:rPr>
-        <w:t xml:space="preserve">Port of </w:t>
-      </w:r>
-      <w:proofErr w:type="gramStart"/>
-      <w:r>
-        <w:rPr>
-          <w:b/>
-          <w:sz w:val="18"/>
-        </w:rPr>
-        <w:t>Discharge</w:t>
+        <w:t>Port of Discharge</w:t>
       </w:r>
       <w:r>
         <w:rPr>
@@ -494,7 +486,6 @@
         </w:rPr>
         <w:t>:</w:t>
       </w:r>
-      <w:proofErr w:type="gramEnd"/>
       <w:r>
         <w:rPr>
           <w:b/>
@@ -524,11 +515,7 @@
         <w:ind w:left="113"/>
       </w:pPr>
       <w:r>
-        <w:t xml:space="preserve">We are pleased to quote you the </w:t>
-      </w:r>
-      <w:proofErr w:type="gramStart"/>
-      <w:r>
-        <w:t xml:space="preserve">following </w:t>
+        <w:t xml:space="preserve">We are pleased to quote you the following </w:t>
       </w:r>
       <w:r>
         <w:rPr>
@@ -536,7 +523,6 @@
         </w:rPr>
         <w:t>:</w:t>
       </w:r>
-      <w:proofErr w:type="gramEnd"/>
     </w:p>
     <w:p>
       <w:pPr>
@@ -549,13 +535,8 @@
         </w:rPr>
         <w:br w:type="column"/>
       </w:r>
-      <w:proofErr w:type="gramStart"/>
-      <w:r>
-        <w:t>PT.RADIX</w:t>
-      </w:r>
-      <w:proofErr w:type="gramEnd"/>
-      <w:r>
-        <w:t xml:space="preserve"> INTERNATIONAL </w:t>
+      <w:r>
+        <w:t xml:space="preserve">PT.RADIX INTERNATIONAL </w:t>
       </w:r>
       <w:r>
         <w:rPr>
@@ -572,7 +553,6 @@
           <w:sz w:val="16"/>
         </w:rPr>
       </w:pPr>
-      <w:proofErr w:type="gramStart"/>
       <w:r>
         <w:rPr>
           <w:b/>
@@ -585,25 +565,16 @@
         <w:rPr>
           <w:sz w:val="16"/>
         </w:rPr>
-        <w:t xml:space="preserve"> :</w:t>
-      </w:r>
-      <w:proofErr w:type="gramEnd"/>
+        <w:t xml:space="preserve"> : </w:t>
+      </w:r>
+      <w:proofErr w:type="spellStart"/>
       <w:r>
         <w:rPr>
           <w:sz w:val="16"/>
         </w:rPr>
-        <w:t xml:space="preserve"> </w:t>
-      </w:r>
-      <w:proofErr w:type="spellStart"/>
-      <w:proofErr w:type="gramStart"/>
-      <w:r>
-        <w:rPr>
-          <w:sz w:val="16"/>
-        </w:rPr>
         <w:t>Jl.Teh</w:t>
       </w:r>
       <w:proofErr w:type="spellEnd"/>
-      <w:proofErr w:type="gramEnd"/>
       <w:r>
         <w:rPr>
           <w:sz w:val="16"/>
@@ -647,7 +618,6 @@
           <w:sz w:val="16"/>
         </w:rPr>
       </w:pPr>
-      <w:proofErr w:type="gramStart"/>
       <w:r>
         <w:rPr>
           <w:b/>
@@ -660,14 +630,7 @@
         <w:rPr>
           <w:sz w:val="16"/>
         </w:rPr>
-        <w:t xml:space="preserve"> :</w:t>
-      </w:r>
-      <w:proofErr w:type="gramEnd"/>
-      <w:r>
-        <w:rPr>
-          <w:sz w:val="16"/>
-        </w:rPr>
-        <w:t xml:space="preserve"> 021-38873060</w:t>
+        <w:t xml:space="preserve"> : 021-38873060</w:t>
       </w:r>
     </w:p>
     <w:p>
@@ -829,15 +792,7 @@
           <w:b/>
           <w:sz w:val="18"/>
         </w:rPr>
-        <w:t xml:space="preserve">VALID </w:t>
-      </w:r>
-      <w:proofErr w:type="gramStart"/>
-      <w:r>
-        <w:rPr>
-          <w:b/>
-          <w:sz w:val="18"/>
-        </w:rPr>
-        <w:t xml:space="preserve">UNTIL </w:t>
+        <w:t xml:space="preserve">VALID UNTIL </w:t>
       </w:r>
       <w:r>
         <w:rPr>
@@ -845,7 +800,6 @@
         </w:rPr>
         <w:t>:</w:t>
       </w:r>
-      <w:proofErr w:type="gramEnd"/>
     </w:p>
     <w:p>
       <w:pPr>
@@ -2614,21 +2568,12 @@
           <w:sz w:val="18"/>
         </w:rPr>
       </w:pPr>
-      <w:proofErr w:type="gramStart"/>
       <w:r>
         <w:rPr>
           <w:color w:val="EE0000"/>
           <w:sz w:val="18"/>
         </w:rPr>
-        <w:t>REMARKS :</w:t>
-      </w:r>
-      <w:proofErr w:type="gramEnd"/>
-      <w:r>
-        <w:rPr>
-          <w:color w:val="EE0000"/>
-          <w:sz w:val="18"/>
-        </w:rPr>
-        <w:t xml:space="preserve"> </w:t>
+        <w:t xml:space="preserve">REMARKS : </w:t>
       </w:r>
     </w:p>
     <w:p>
@@ -2998,13 +2943,8 @@
         <w:spacing w:before="9" w:line="201" w:lineRule="exact"/>
         <w:ind w:left="113"/>
       </w:pPr>
-      <w:proofErr w:type="gramStart"/>
-      <w:r>
-        <w:t>Mobile :</w:t>
-      </w:r>
-      <w:proofErr w:type="gramEnd"/>
-      <w:r>
-        <w:t xml:space="preserve"> </w:t>
+      <w:r>
+        <w:t xml:space="preserve">Mobile : </w:t>
       </w:r>
     </w:p>
     <w:p>
@@ -3013,13 +2953,8 @@
         <w:spacing w:line="201" w:lineRule="exact"/>
         <w:ind w:left="113"/>
       </w:pPr>
-      <w:proofErr w:type="gramStart"/>
-      <w:r>
-        <w:t>Email :</w:t>
-      </w:r>
-      <w:proofErr w:type="gramEnd"/>
-      <w:r>
-        <w:t xml:space="preserve"> </w:t>
+      <w:r>
+        <w:t xml:space="preserve">Email : </w:t>
       </w:r>
     </w:p>
     <w:sectPr>
@@ -3033,7 +2968,7 @@
 </file>
 
 <file path=word/endnotes.xml><?xml version="1.0" encoding="utf-8"?>
-<w:endnotes xmlns:wpc="http://schemas.microsoft.com/office/word/2010/wordprocessingCanvas" xmlns:cx="http://schemas.microsoft.com/office/drawing/2014/chartex" xmlns:cx1="http://schemas.microsoft.com/office/drawing/2015/9/8/chartex" xmlns:cx2="http://schemas.microsoft.com/office/drawing/2015/10/21/chartex" xmlns:cx3="http://schemas.microsoft.com/office/drawing/2016/5/9/chartex" xmlns:cx4="http://schemas.microsoft.com/office/drawing/2016/5/10/chartex" xmlns:cx5="http://schemas.microsoft.com/office/drawing/2016/5/11/chartex" xmlns:cx6="http://schemas.microsoft.com/office/drawing/2016/5/12/chartex" xmlns:cx7="http://schemas.microsoft.com/office/drawing/2016/5/13/chartex" xmlns:cx8="http://schemas.microsoft.com/office/drawing/2016/5/14/chartex" xmlns:mc="http://schemas.openxmlformats.org/markup-compatibility/2006" xmlns:aink="http://schemas.microsoft.com/office/drawing/2016/ink" xmlns:am3d="http://schemas.microsoft.com/office/drawing/2017/model3d" xmlns:o="urn:schemas-microsoft-com:office:office" xmlns:oel="http://schemas.microsoft.com/office/2019/extlst" xmlns:r="http://schemas.openxmlformats.org/officeDocument/2006/relationships" xmlns:m="http://schemas.openxmlformats.org/officeDocument/2006/math" xmlns:v="urn:schemas-microsoft-com:vml" xmlns:wp14="http://schemas.microsoft.com/office/word/2010/wordprocessingDrawing" xmlns:wp="http://schemas.openxmlformats.org/drawingml/2006/wordprocessingDrawing" xmlns:w10="urn:schemas-microsoft-com:office:word" xmlns:w="http://schemas.openxmlformats.org/wordprocessingml/2006/main" xmlns:w14="http://schemas.microsoft.com/office/word/2010/wordml" xmlns:w15="http://schemas.microsoft.com/office/word/2012/wordml" xmlns:w16cex="http://schemas.microsoft.com/office/word/2018/wordml/cex" xmlns:w16cid="http://schemas.microsoft.com/office/word/2016/wordml/cid" xmlns:w16="http://schemas.microsoft.com/office/word/2018/wordml" xmlns:w16du="http://schemas.microsoft.com/office/word/2023/wordml/word16du" xmlns:w16sdtdh="http://schemas.microsoft.com/office/word/2020/wordml/sdtdatahash" xmlns:w16sdtfl="http://schemas.microsoft.com/office/word/2024/wordml/sdtformatlock" xmlns:w16se="http://schemas.microsoft.com/office/word/2015/wordml/symex" xmlns:wpg="http://schemas.microsoft.com/office/word/2010/wordprocessingGroup" xmlns:wpi="http://schemas.microsoft.com/office/word/2010/wordprocessingInk" xmlns:wne="http://schemas.microsoft.com/office/word/2006/wordml" xmlns:wps="http://schemas.microsoft.com/office/word/2010/wordprocessingShape" mc:Ignorable="w14 w15 w16se w16cid w16 w16cex w16sdtdh w16sdtfl w16du wp14">
+<w:endnotes xmlns:wpc="http://schemas.microsoft.com/office/word/2010/wordprocessingCanvas" xmlns:cx="http://schemas.microsoft.com/office/drawing/2014/chartex" xmlns:cx1="http://schemas.microsoft.com/office/drawing/2015/9/8/chartex" xmlns:cx2="http://schemas.microsoft.com/office/drawing/2015/10/21/chartex" xmlns:cx3="http://schemas.microsoft.com/office/drawing/2016/5/9/chartex" xmlns:cx4="http://schemas.microsoft.com/office/drawing/2016/5/10/chartex" xmlns:cx5="http://schemas.microsoft.com/office/drawing/2016/5/11/chartex" xmlns:cx6="http://schemas.microsoft.com/office/drawing/2016/5/12/chartex" xmlns:cx7="http://schemas.microsoft.com/office/drawing/2016/5/13/chartex" xmlns:cx8="http://schemas.microsoft.com/office/drawing/2016/5/14/chartex" xmlns:mc="http://schemas.openxmlformats.org/markup-compatibility/2006" xmlns:aink="http://schemas.microsoft.com/office/drawing/2016/ink" xmlns:am3d="http://schemas.microsoft.com/office/drawing/2017/model3d" xmlns:o="urn:schemas-microsoft-com:office:office" xmlns:oel="http://schemas.microsoft.com/office/2019/extlst" xmlns:r="http://schemas.openxmlformats.org/officeDocument/2006/relationships" xmlns:m="http://schemas.openxmlformats.org/officeDocument/2006/math" xmlns:v="urn:schemas-microsoft-com:vml" xmlns:wp14="http://schemas.microsoft.com/office/word/2010/wordprocessingDrawing" xmlns:wp="http://schemas.openxmlformats.org/drawingml/2006/wordprocessingDrawing" xmlns:w10="urn:schemas-microsoft-com:office:word" xmlns:w="http://schemas.openxmlformats.org/wordprocessingml/2006/main" xmlns:w14="http://schemas.microsoft.com/office/word/2010/wordml" xmlns:w15="http://schemas.microsoft.com/office/word/2012/wordml" xmlns:w16cex="http://schemas.microsoft.com/office/word/2018/wordml/cex" xmlns:w16cid="http://schemas.microsoft.com/office/word/2016/wordml/cid" xmlns:w16="http://schemas.microsoft.com/office/word/2018/wordml" xmlns:w16sdtdh="http://schemas.microsoft.com/office/word/2020/wordml/sdtdatahash" xmlns:w16se="http://schemas.microsoft.com/office/word/2015/wordml/symex" xmlns:wpg="http://schemas.microsoft.com/office/word/2010/wordprocessingGroup" xmlns:wpi="http://schemas.microsoft.com/office/word/2010/wordprocessingInk" xmlns:wne="http://schemas.microsoft.com/office/word/2006/wordml" xmlns:wps="http://schemas.microsoft.com/office/word/2010/wordprocessingShape" mc:Ignorable="w14 w15 w16se w16cid w16 w16cex w16sdtdh wp14">
   <w:endnote w:type="separator" w:id="-1">
     <w:p>
       <w:r>
@@ -3052,7 +2987,7 @@
 </file>
 
 <file path=word/footer1.xml><?xml version="1.0" encoding="utf-8"?>
-<w:ftr xmlns:wpc="http://schemas.microsoft.com/office/word/2010/wordprocessingCanvas" xmlns:cx="http://schemas.microsoft.com/office/drawing/2014/chartex" xmlns:cx1="http://schemas.microsoft.com/office/drawing/2015/9/8/chartex" xmlns:cx2="http://schemas.microsoft.com/office/drawing/2015/10/21/chartex" xmlns:cx3="http://schemas.microsoft.com/office/drawing/2016/5/9/chartex" xmlns:cx4="http://schemas.microsoft.com/office/drawing/2016/5/10/chartex" xmlns:cx5="http://schemas.microsoft.com/office/drawing/2016/5/11/chartex" xmlns:cx6="http://schemas.microsoft.com/office/drawing/2016/5/12/chartex" xmlns:cx7="http://schemas.microsoft.com/office/drawing/2016/5/13/chartex" xmlns:cx8="http://schemas.microsoft.com/office/drawing/2016/5/14/chartex" xmlns:mc="http://schemas.openxmlformats.org/markup-compatibility/2006" xmlns:aink="http://schemas.microsoft.com/office/drawing/2016/ink" xmlns:am3d="http://schemas.microsoft.com/office/drawing/2017/model3d" xmlns:o="urn:schemas-microsoft-com:office:office" xmlns:oel="http://schemas.microsoft.com/office/2019/extlst" xmlns:r="http://schemas.openxmlformats.org/officeDocument/2006/relationships" xmlns:m="http://schemas.openxmlformats.org/officeDocument/2006/math" xmlns:v="urn:schemas-microsoft-com:vml" xmlns:wp14="http://schemas.microsoft.com/office/word/2010/wordprocessingDrawing" xmlns:wp="http://schemas.openxmlformats.org/drawingml/2006/wordprocessingDrawing" xmlns:w10="urn:schemas-microsoft-com:office:word" xmlns:w="http://schemas.openxmlformats.org/wordprocessingml/2006/main" xmlns:w14="http://schemas.microsoft.com/office/word/2010/wordml" xmlns:w15="http://schemas.microsoft.com/office/word/2012/wordml" xmlns:w16cex="http://schemas.microsoft.com/office/word/2018/wordml/cex" xmlns:w16cid="http://schemas.microsoft.com/office/word/2016/wordml/cid" xmlns:w16="http://schemas.microsoft.com/office/word/2018/wordml" xmlns:w16du="http://schemas.microsoft.com/office/word/2023/wordml/word16du" xmlns:w16sdtdh="http://schemas.microsoft.com/office/word/2020/wordml/sdtdatahash" xmlns:w16sdtfl="http://schemas.microsoft.com/office/word/2024/wordml/sdtformatlock" xmlns:w16se="http://schemas.microsoft.com/office/word/2015/wordml/symex" xmlns:wpg="http://schemas.microsoft.com/office/word/2010/wordprocessingGroup" xmlns:wpi="http://schemas.microsoft.com/office/word/2010/wordprocessingInk" xmlns:wne="http://schemas.microsoft.com/office/word/2006/wordml" xmlns:wps="http://schemas.microsoft.com/office/word/2010/wordprocessingShape" mc:Ignorable="w14 w15 w16se w16cid w16 w16cex w16sdtdh w16sdtfl w16du wp14">
+<w:ftr xmlns:wpc="http://schemas.microsoft.com/office/word/2010/wordprocessingCanvas" xmlns:cx="http://schemas.microsoft.com/office/drawing/2014/chartex" xmlns:cx1="http://schemas.microsoft.com/office/drawing/2015/9/8/chartex" xmlns:cx2="http://schemas.microsoft.com/office/drawing/2015/10/21/chartex" xmlns:cx3="http://schemas.microsoft.com/office/drawing/2016/5/9/chartex" xmlns:cx4="http://schemas.microsoft.com/office/drawing/2016/5/10/chartex" xmlns:cx5="http://schemas.microsoft.com/office/drawing/2016/5/11/chartex" xmlns:cx6="http://schemas.microsoft.com/office/drawing/2016/5/12/chartex" xmlns:cx7="http://schemas.microsoft.com/office/drawing/2016/5/13/chartex" xmlns:cx8="http://schemas.microsoft.com/office/drawing/2016/5/14/chartex" xmlns:mc="http://schemas.openxmlformats.org/markup-compatibility/2006" xmlns:aink="http://schemas.microsoft.com/office/drawing/2016/ink" xmlns:am3d="http://schemas.microsoft.com/office/drawing/2017/model3d" xmlns:o="urn:schemas-microsoft-com:office:office" xmlns:oel="http://schemas.microsoft.com/office/2019/extlst" xmlns:r="http://schemas.openxmlformats.org/officeDocument/2006/relationships" xmlns:m="http://schemas.openxmlformats.org/officeDocument/2006/math" xmlns:v="urn:schemas-microsoft-com:vml" xmlns:wp14="http://schemas.microsoft.com/office/word/2010/wordprocessingDrawing" xmlns:wp="http://schemas.openxmlformats.org/drawingml/2006/wordprocessingDrawing" xmlns:w10="urn:schemas-microsoft-com:office:word" xmlns:w="http://schemas.openxmlformats.org/wordprocessingml/2006/main" xmlns:w14="http://schemas.microsoft.com/office/word/2010/wordml" xmlns:w15="http://schemas.microsoft.com/office/word/2012/wordml" xmlns:w16cex="http://schemas.microsoft.com/office/word/2018/wordml/cex" xmlns:w16cid="http://schemas.microsoft.com/office/word/2016/wordml/cid" xmlns:w16="http://schemas.microsoft.com/office/word/2018/wordml" xmlns:w16sdtdh="http://schemas.microsoft.com/office/word/2020/wordml/sdtdatahash" xmlns:w16se="http://schemas.microsoft.com/office/word/2015/wordml/symex" xmlns:wpg="http://schemas.microsoft.com/office/word/2010/wordprocessingGroup" xmlns:wpi="http://schemas.microsoft.com/office/word/2010/wordprocessingInk" xmlns:wne="http://schemas.microsoft.com/office/word/2006/wordml" xmlns:wps="http://schemas.microsoft.com/office/word/2010/wordprocessingShape" mc:Ignorable="w14 w15 w16se w16cid w16 w16cex w16sdtdh wp14">
   <w:p>
     <w:pPr>
       <w:pStyle w:val="BodyText"/>
@@ -3137,7 +3072,7 @@
             </wp:anchor>
           </w:drawing>
         </mc:Choice>
-        <mc:Fallback>
+        <mc:Fallback xmlns:w16sdtfl="http://schemas.microsoft.com/office/word/2024/wordml/sdtformatlock" xmlns:w16du="http://schemas.microsoft.com/office/word/2023/wordml/word16du">
           <w:pict>
             <v:shapetype w14:anchorId="241C5F5E" id="_x0000_t202" coordsize="21600,21600" o:spt="202" path="m,l,21600r21600,l21600,xe">
               <v:stroke joinstyle="miter"/>
@@ -3184,7 +3119,7 @@
 </file>
 
 <file path=word/footnotes.xml><?xml version="1.0" encoding="utf-8"?>
-<w:footnotes xmlns:wpc="http://schemas.microsoft.com/office/word/2010/wordprocessingCanvas" xmlns:cx="http://schemas.microsoft.com/office/drawing/2014/chartex" xmlns:cx1="http://schemas.microsoft.com/office/drawing/2015/9/8/chartex" xmlns:cx2="http://schemas.microsoft.com/office/drawing/2015/10/21/chartex" xmlns:cx3="http://schemas.microsoft.com/office/drawing/2016/5/9/chartex" xmlns:cx4="http://schemas.microsoft.com/office/drawing/2016/5/10/chartex" xmlns:cx5="http://schemas.microsoft.com/office/drawing/2016/5/11/chartex" xmlns:cx6="http://schemas.microsoft.com/office/drawing/2016/5/12/chartex" xmlns:cx7="http://schemas.microsoft.com/office/drawing/2016/5/13/chartex" xmlns:cx8="http://schemas.microsoft.com/office/drawing/2016/5/14/chartex" xmlns:mc="http://schemas.openxmlformats.org/markup-compatibility/2006" xmlns:aink="http://schemas.microsoft.com/office/drawing/2016/ink" xmlns:am3d="http://schemas.microsoft.com/office/drawing/2017/model3d" xmlns:o="urn:schemas-microsoft-com:office:office" xmlns:oel="http://schemas.microsoft.com/office/2019/extlst" xmlns:r="http://schemas.openxmlformats.org/officeDocument/2006/relationships" xmlns:m="http://schemas.openxmlformats.org/officeDocument/2006/math" xmlns:v="urn:schemas-microsoft-com:vml" xmlns:wp14="http://schemas.microsoft.com/office/word/2010/wordprocessingDrawing" xmlns:wp="http://schemas.openxmlformats.org/drawingml/2006/wordprocessingDrawing" xmlns:w10="urn:schemas-microsoft-com:office:word" xmlns:w="http://schemas.openxmlformats.org/wordprocessingml/2006/main" xmlns:w14="http://schemas.microsoft.com/office/word/2010/wordml" xmlns:w15="http://schemas.microsoft.com/office/word/2012/wordml" xmlns:w16cex="http://schemas.microsoft.com/office/word/2018/wordml/cex" xmlns:w16cid="http://schemas.microsoft.com/office/word/2016/wordml/cid" xmlns:w16="http://schemas.microsoft.com/office/word/2018/wordml" xmlns:w16du="http://schemas.microsoft.com/office/word/2023/wordml/word16du" xmlns:w16sdtdh="http://schemas.microsoft.com/office/word/2020/wordml/sdtdatahash" xmlns:w16sdtfl="http://schemas.microsoft.com/office/word/2024/wordml/sdtformatlock" xmlns:w16se="http://schemas.microsoft.com/office/word/2015/wordml/symex" xmlns:wpg="http://schemas.microsoft.com/office/word/2010/wordprocessingGroup" xmlns:wpi="http://schemas.microsoft.com/office/word/2010/wordprocessingInk" xmlns:wne="http://schemas.microsoft.com/office/word/2006/wordml" xmlns:wps="http://schemas.microsoft.com/office/word/2010/wordprocessingShape" mc:Ignorable="w14 w15 w16se w16cid w16 w16cex w16sdtdh w16sdtfl w16du wp14">
+<w:footnotes xmlns:wpc="http://schemas.microsoft.com/office/word/2010/wordprocessingCanvas" xmlns:cx="http://schemas.microsoft.com/office/drawing/2014/chartex" xmlns:cx1="http://schemas.microsoft.com/office/drawing/2015/9/8/chartex" xmlns:cx2="http://schemas.microsoft.com/office/drawing/2015/10/21/chartex" xmlns:cx3="http://schemas.microsoft.com/office/drawing/2016/5/9/chartex" xmlns:cx4="http://schemas.microsoft.com/office/drawing/2016/5/10/chartex" xmlns:cx5="http://schemas.microsoft.com/office/drawing/2016/5/11/chartex" xmlns:cx6="http://schemas.microsoft.com/office/drawing/2016/5/12/chartex" xmlns:cx7="http://schemas.microsoft.com/office/drawing/2016/5/13/chartex" xmlns:cx8="http://schemas.microsoft.com/office/drawing/2016/5/14/chartex" xmlns:mc="http://schemas.openxmlformats.org/markup-compatibility/2006" xmlns:aink="http://schemas.microsoft.com/office/drawing/2016/ink" xmlns:am3d="http://schemas.microsoft.com/office/drawing/2017/model3d" xmlns:o="urn:schemas-microsoft-com:office:office" xmlns:oel="http://schemas.microsoft.com/office/2019/extlst" xmlns:r="http://schemas.openxmlformats.org/officeDocument/2006/relationships" xmlns:m="http://schemas.openxmlformats.org/officeDocument/2006/math" xmlns:v="urn:schemas-microsoft-com:vml" xmlns:wp14="http://schemas.microsoft.com/office/word/2010/wordprocessingDrawing" xmlns:wp="http://schemas.openxmlformats.org/drawingml/2006/wordprocessingDrawing" xmlns:w10="urn:schemas-microsoft-com:office:word" xmlns:w="http://schemas.openxmlformats.org/wordprocessingml/2006/main" xmlns:w14="http://schemas.microsoft.com/office/word/2010/wordml" xmlns:w15="http://schemas.microsoft.com/office/word/2012/wordml" xmlns:w16cex="http://schemas.microsoft.com/office/word/2018/wordml/cex" xmlns:w16cid="http://schemas.microsoft.com/office/word/2016/wordml/cid" xmlns:w16="http://schemas.microsoft.com/office/word/2018/wordml" xmlns:w16sdtdh="http://schemas.microsoft.com/office/word/2020/wordml/sdtdatahash" xmlns:w16se="http://schemas.microsoft.com/office/word/2015/wordml/symex" xmlns:wpg="http://schemas.microsoft.com/office/word/2010/wordprocessingGroup" xmlns:wpi="http://schemas.microsoft.com/office/word/2010/wordprocessingInk" xmlns:wne="http://schemas.microsoft.com/office/word/2006/wordml" xmlns:wps="http://schemas.microsoft.com/office/word/2010/wordprocessingShape" mc:Ignorable="w14 w15 w16se w16cid w16 w16cex w16sdtdh wp14">
   <w:footnote w:type="separator" w:id="-1">
     <w:p>
       <w:r>
@@ -3203,7 +3138,7 @@
 </file>
 
 <file path=word/numbering.xml><?xml version="1.0" encoding="utf-8"?>
-<w:numbering xmlns:wpc="http://schemas.microsoft.com/office/word/2010/wordprocessingCanvas" xmlns:cx="http://schemas.microsoft.com/office/drawing/2014/chartex" xmlns:cx1="http://schemas.microsoft.com/office/drawing/2015/9/8/chartex" xmlns:cx2="http://schemas.microsoft.com/office/drawing/2015/10/21/chartex" xmlns:cx3="http://schemas.microsoft.com/office/drawing/2016/5/9/chartex" xmlns:cx4="http://schemas.microsoft.com/office/drawing/2016/5/10/chartex" xmlns:cx5="http://schemas.microsoft.com/office/drawing/2016/5/11/chartex" xmlns:cx6="http://schemas.microsoft.com/office/drawing/2016/5/12/chartex" xmlns:cx7="http://schemas.microsoft.com/office/drawing/2016/5/13/chartex" xmlns:cx8="http://schemas.microsoft.com/office/drawing/2016/5/14/chartex" xmlns:mc="http://schemas.openxmlformats.org/markup-compatibility/2006" xmlns:aink="http://schemas.microsoft.com/office/drawing/2016/ink" xmlns:am3d="http://schemas.microsoft.com/office/drawing/2017/model3d" xmlns:o="urn:schemas-microsoft-com:office:office" xmlns:oel="http://schemas.microsoft.com/office/2019/extlst" xmlns:r="http://schemas.openxmlformats.org/officeDocument/2006/relationships" xmlns:m="http://schemas.openxmlformats.org/officeDocument/2006/math" xmlns:v="urn:schemas-microsoft-com:vml" xmlns:wp14="http://schemas.microsoft.com/office/word/2010/wordprocessingDrawing" xmlns:wp="http://schemas.openxmlformats.org/drawingml/2006/wordprocessingDrawing" xmlns:w10="urn:schemas-microsoft-com:office:word" xmlns:w="http://schemas.openxmlformats.org/wordprocessingml/2006/main" xmlns:w14="http://schemas.microsoft.com/office/word/2010/wordml" xmlns:w15="http://schemas.microsoft.com/office/word/2012/wordml" xmlns:w16cex="http://schemas.microsoft.com/office/word/2018/wordml/cex" xmlns:w16cid="http://schemas.microsoft.com/office/word/2016/wordml/cid" xmlns:w16="http://schemas.microsoft.com/office/word/2018/wordml" xmlns:w16du="http://schemas.microsoft.com/office/word/2023/wordml/word16du" xmlns:w16sdtdh="http://schemas.microsoft.com/office/word/2020/wordml/sdtdatahash" xmlns:w16sdtfl="http://schemas.microsoft.com/office/word/2024/wordml/sdtformatlock" xmlns:w16se="http://schemas.microsoft.com/office/word/2015/wordml/symex" xmlns:wpg="http://schemas.microsoft.com/office/word/2010/wordprocessingGroup" xmlns:wpi="http://schemas.microsoft.com/office/word/2010/wordprocessingInk" xmlns:wne="http://schemas.microsoft.com/office/word/2006/wordml" xmlns:wps="http://schemas.microsoft.com/office/word/2010/wordprocessingShape" mc:Ignorable="w14 w15 w16se w16cid w16 w16cex w16sdtdh w16sdtfl w16du wp14">
+<w:numbering xmlns:wpc="http://schemas.microsoft.com/office/word/2010/wordprocessingCanvas" xmlns:cx="http://schemas.microsoft.com/office/drawing/2014/chartex" xmlns:cx1="http://schemas.microsoft.com/office/drawing/2015/9/8/chartex" xmlns:cx2="http://schemas.microsoft.com/office/drawing/2015/10/21/chartex" xmlns:cx3="http://schemas.microsoft.com/office/drawing/2016/5/9/chartex" xmlns:cx4="http://schemas.microsoft.com/office/drawing/2016/5/10/chartex" xmlns:cx5="http://schemas.microsoft.com/office/drawing/2016/5/11/chartex" xmlns:cx6="http://schemas.microsoft.com/office/drawing/2016/5/12/chartex" xmlns:cx7="http://schemas.microsoft.com/office/drawing/2016/5/13/chartex" xmlns:cx8="http://schemas.microsoft.com/office/drawing/2016/5/14/chartex" xmlns:mc="http://schemas.openxmlformats.org/markup-compatibility/2006" xmlns:aink="http://schemas.microsoft.com/office/drawing/2016/ink" xmlns:am3d="http://schemas.microsoft.com/office/drawing/2017/model3d" xmlns:o="urn:schemas-microsoft-com:office:office" xmlns:oel="http://schemas.microsoft.com/office/2019/extlst" xmlns:r="http://schemas.openxmlformats.org/officeDocument/2006/relationships" xmlns:m="http://schemas.openxmlformats.org/officeDocument/2006/math" xmlns:v="urn:schemas-microsoft-com:vml" xmlns:wp14="http://schemas.microsoft.com/office/word/2010/wordprocessingDrawing" xmlns:wp="http://schemas.openxmlformats.org/drawingml/2006/wordprocessingDrawing" xmlns:w10="urn:schemas-microsoft-com:office:word" xmlns:w="http://schemas.openxmlformats.org/wordprocessingml/2006/main" xmlns:w14="http://schemas.microsoft.com/office/word/2010/wordml" xmlns:w15="http://schemas.microsoft.com/office/word/2012/wordml" xmlns:w16cex="http://schemas.microsoft.com/office/word/2018/wordml/cex" xmlns:w16cid="http://schemas.microsoft.com/office/word/2016/wordml/cid" xmlns:w16="http://schemas.microsoft.com/office/word/2018/wordml" xmlns:w16sdtdh="http://schemas.microsoft.com/office/word/2020/wordml/sdtdatahash" xmlns:w16se="http://schemas.microsoft.com/office/word/2015/wordml/symex" xmlns:wpg="http://schemas.microsoft.com/office/word/2010/wordprocessingGroup" xmlns:wpi="http://schemas.microsoft.com/office/word/2010/wordprocessingInk" xmlns:wne="http://schemas.microsoft.com/office/word/2006/wordml" xmlns:wps="http://schemas.microsoft.com/office/word/2010/wordprocessingShape" mc:Ignorable="w14 w15 w16se w16cid w16 w16cex w16sdtdh wp14">
   <w:abstractNum w:abstractNumId="0" w15:restartNumberingAfterBreak="0">
     <w:nsid w:val="07EA4153"/>
     <w:multiLevelType w:val="hybridMultilevel"/>
@@ -3334,7 +3269,7 @@
 </file>
 
 <file path=word/styles.xml><?xml version="1.0" encoding="utf-8"?>
-<w:styles xmlns:mc="http://schemas.openxmlformats.org/markup-compatibility/2006" xmlns:r="http://schemas.openxmlformats.org/officeDocument/2006/relationships" xmlns:w="http://schemas.openxmlformats.org/wordprocessingml/2006/main" xmlns:w14="http://schemas.microsoft.com/office/word/2010/wordml" xmlns:w15="http://schemas.microsoft.com/office/word/2012/wordml" xmlns:w16cex="http://schemas.microsoft.com/office/word/2018/wordml/cex" xmlns:w16cid="http://schemas.microsoft.com/office/word/2016/wordml/cid" xmlns:w16="http://schemas.microsoft.com/office/word/2018/wordml" xmlns:w16du="http://schemas.microsoft.com/office/word/2023/wordml/word16du" xmlns:w16sdtdh="http://schemas.microsoft.com/office/word/2020/wordml/sdtdatahash" xmlns:w16sdtfl="http://schemas.microsoft.com/office/word/2024/wordml/sdtformatlock" xmlns:w16se="http://schemas.microsoft.com/office/word/2015/wordml/symex" mc:Ignorable="w14 w15 w16se w16cid w16 w16cex w16sdtdh w16sdtfl w16du">
+<w:styles xmlns:mc="http://schemas.openxmlformats.org/markup-compatibility/2006" xmlns:r="http://schemas.openxmlformats.org/officeDocument/2006/relationships" xmlns:w="http://schemas.openxmlformats.org/wordprocessingml/2006/main" xmlns:w14="http://schemas.microsoft.com/office/word/2010/wordml" xmlns:w15="http://schemas.microsoft.com/office/word/2012/wordml" xmlns:w16cex="http://schemas.microsoft.com/office/word/2018/wordml/cex" xmlns:w16cid="http://schemas.microsoft.com/office/word/2016/wordml/cid" xmlns:w16="http://schemas.microsoft.com/office/word/2018/wordml" xmlns:w16sdtdh="http://schemas.microsoft.com/office/word/2020/wordml/sdtdatahash" xmlns:w16se="http://schemas.microsoft.com/office/word/2015/wordml/symex" mc:Ignorable="w14 w15 w16se w16cid w16 w16cex w16sdtdh">
   <w:docDefaults>
     <w:rPrDefault>
       <w:rPr>

</xml_diff>